<commit_message>
Bericht: Anhang A mit Repository-URL, Ein-Notebook-Struktur; README mit Repo-Link
</commit_message>
<xml_diff>
--- a/bericht/Bericht_ADS04_Profitvorhersage.docx
+++ b/bericht/Bericht_ADS04_Profitvorhersage.docx
@@ -782,7 +782,7 @@
           <w:sz w:val="24"/>
           <w:szCs w:val="24"/>
         </w:rPr>
-        <w:t xml:space="preserve">Kapitel 2 beschreibt Daten, Datenqualität und Methodik, Kapitel 3 die Ergebnisse, Kapitel 4 die Diskussion und die Handlungsempfehlungen. Die vollständige, reproduzierbare Analyse liegt als neun nummerierte Jupyter-Notebooks im begleitenden Repository vor (Anhang A).</w:t>
+        <w:t xml:space="preserve">Kapitel 2 beschreibt Daten, Datenqualität und Methodik, Kapitel 3 die Ergebnisse, Kapitel 4 die Diskussion und die Handlungsempfehlungen. Die vollständige, reproduzierbare Analyse liegt als durchgehend ausführbares Jupyter-Notebook im begleitenden Repository vor (Anhang A).</w:t>
       </w:r>
     </w:p>
     <w:p>
@@ -3962,7 +3962,7 @@
           <w:sz w:val="24"/>
           <w:szCs w:val="24"/>
         </w:rPr>
-        <w:t xml:space="preserve">Analyseprojekt als GitHub-Repository mit neun Jupyter-Notebooks (01_datenaufbereitung, 02_eda, 03_modellvergleich, 04_tuning, 05_overfitting, 06_test_evaluation, 07_struktur_der_zielgroesse, 08_signifikanz, 09_diagnostik), Rohdaten, Abbildungen und Ergebnisdateien. Die Notebooks sind in Ausführungsreihenfolge nummeriert und liegen vollständig ausgeführt mit allen Ausgaben vor. Repository-URL: [nach dem Upload eintragen].</w:t>
+        <w:t xml:space="preserve">Analyseprojekt als GitHub-Repository unter https://github.com/mohammed-hmed/ads04-profitvorhersage-superstore. Es enthält die gesamte Analyse als ein durchgehend ausführbares Jupyter-Notebook (notebooks/ADS04_Gesamtanalyse.ipynb) mit neun aufeinander aufbauenden Teilen (01 Datenaufbereitung, 02 explorative Analyse, 03 Modellvergleich, 04 Tuning, 05 Overfitting, 06 Testevaluation, 07 Struktur der Zielgröße, 08 Signifikanz, 09 Diagnostik), daneben eine inhaltsgleiche Fassung ohne Fließtext (ADS04_Gesamtanalyse_nur_Code.ipynb) sowie Rohdaten, aufbereitete Daten, Abbildungen und Ergebnisdateien. Beide Notebooks liegen vollständig ausgeführt mit allen Ausgaben vor; die Ausführungszähler laufen lückenlos von 1 bis 47.</w:t>
       </w:r>
     </w:p>
     <w:p>

</xml_diff>

<commit_message>
Bericht mit den neuen Abbildungen, englische Begriffe kursiv, Zahl auf 0,654 vereinheitlicht
</commit_message>
<xml_diff>
--- a/bericht/Bericht_ADS04_Profitvorhersage.docx
+++ b/bericht/Bericht_ADS04_Profitvorhersage.docx
@@ -651,7 +651,25 @@
           <w:sz w:val="24"/>
           <w:szCs w:val="24"/>
         </w:rPr>
-        <w:t xml:space="preserve">Die Arbeit untersucht, wie genau sich der Gewinn (Profit) einer Bestellposition im Global-Superstore-Datensatz vorhersagen lässt. Auf Basis von 51.290 Bestellpositionen aus sieben Weltmärkten (2011–2014) werden drei Transformationspipelines und sechs Regressionsalgorithmen per 5-facher Cross-Validation verglichen und anschließend optimiert. Eine Pipeline mit polynomialen Interaktionstermen hebt die Güte der linearen Modelle von R² = 0,34 auf 0,71, weil sie den ökonomisch zentralen Zusammenhang aus Umsatz und Rabatt abbildet. Auf den Testdaten erreichen das lineare Interaktionsmodell (R² = 0,663) und der Random Forest (0,654) eine gleichwertige Güte; die Differenz liegt innerhalb der Fold-Streuung und kehrt sich bei gruppiertem oder zeitlichem Split um. Für das Management folgen drei Empfehlungen: Rabatte oberhalb von 25 Prozent an eine Profitprüfung koppeln, für die Sub-Category tables eine Rabattobergrenze einführen und die Kennzeichnung von Verlustpositionen über eine Fachregel statt über das Regressionsmodell steuern.</w:t>
+        <w:t xml:space="preserve">Die Arbeit untersucht, wie genau sich der Gewinn (Profit) einer Bestellposition im Global-Superstore-Datensatz vorhersagen lässt. Auf Basis von 51.290 Bestellpositionen aus sieben Weltmärkten (2011–2014) werden drei Transformationspipelines und sechs Regressionsalgorithmen per 5-facher Cross-Validation verglichen und anschließend optimiert. Eine Pipeline mit polynomialen Interaktionstermen hebt die Güte der linearen Modelle von R² = 0,34 auf 0,71, weil sie den ökonomisch zentralen Zusammenhang aus Umsatz und Rabatt abbildet. Auf den Testdaten erreichen das lineare Interaktionsmodell (R² = 0,663) und der Random Forest (0,654) eine gleichwertige Güte; die Differenz liegt innerhalb der Fold-Streuung und kehrt sich bei gruppiertem oder zeitlichem Split um. Für das Management folgen drei Empfehlungen: Rabatte oberhalb von 25 Prozent an eine Profitprüfung koppeln, für die Sub-Category </w:t>
+      </w:r>
+      <w:r>
+        <w:rPr>
+          <w:rFonts w:ascii="Times New Roman" w:cs="Times New Roman" w:eastAsia="Times New Roman" w:hAnsi="Times New Roman"/>
+          <w:i/>
+          <w:iCs/>
+          <w:sz w:val="24"/>
+          <w:szCs w:val="24"/>
+        </w:rPr>
+        <w:t xml:space="preserve">tables</w:t>
+      </w:r>
+      <w:r>
+        <w:rPr>
+          <w:rFonts w:ascii="Times New Roman" w:cs="Times New Roman" w:eastAsia="Times New Roman" w:hAnsi="Times New Roman"/>
+          <w:sz w:val="24"/>
+          <w:szCs w:val="24"/>
+        </w:rPr>
+        <w:t xml:space="preserve"> eine Rabattobergrenze einführen und die Kennzeichnung von Verlustpositionen über eine Fachregel statt über das Regressionsmodell steuern.</w:t>
       </w:r>
     </w:p>
     <w:p>
@@ -1777,7 +1795,79 @@
           <w:sz w:val="24"/>
           <w:szCs w:val="24"/>
         </w:rPr>
-        <w:t xml:space="preserve">In der Sortimentsperspektive weist tables mit −80,92 USD je Position als einzige Unterkategorie einen negativen Mittelwert auf, während copiers (120,98 USD) und appliances (82,80 USD) am profitabelsten sind. Eine Aufschlüsselung nach Rabattstufen zeigt jedoch, dass tables ohne Rabatt mit +292,86 USD je Position der profitabelste Bereich überhaupt ist und erst oberhalb von 20 Prozent Rabatt ins Minus rutscht (20 bis 40 Prozent: −170,44 USD; über 60 Prozent: −644,95 USD). Der Verlust folgt also aus der Rabattvergabe, nicht aus der Kalkulation.</w:t>
+        <w:t xml:space="preserve">In der Sortimentsperspektive weist </w:t>
+      </w:r>
+      <w:r>
+        <w:rPr>
+          <w:rFonts w:ascii="Times New Roman" w:cs="Times New Roman" w:eastAsia="Times New Roman" w:hAnsi="Times New Roman"/>
+          <w:i/>
+          <w:iCs/>
+          <w:sz w:val="24"/>
+          <w:szCs w:val="24"/>
+        </w:rPr>
+        <w:t xml:space="preserve">tables</w:t>
+      </w:r>
+      <w:r>
+        <w:rPr>
+          <w:rFonts w:ascii="Times New Roman" w:cs="Times New Roman" w:eastAsia="Times New Roman" w:hAnsi="Times New Roman"/>
+          <w:sz w:val="24"/>
+          <w:szCs w:val="24"/>
+        </w:rPr>
+        <w:t xml:space="preserve"> mit −80,92 USD je Position als einzige Unterkategorie einen negativen Mittelwert auf, während </w:t>
+      </w:r>
+      <w:r>
+        <w:rPr>
+          <w:rFonts w:ascii="Times New Roman" w:cs="Times New Roman" w:eastAsia="Times New Roman" w:hAnsi="Times New Roman"/>
+          <w:i/>
+          <w:iCs/>
+          <w:sz w:val="24"/>
+          <w:szCs w:val="24"/>
+        </w:rPr>
+        <w:t xml:space="preserve">copiers</w:t>
+      </w:r>
+      <w:r>
+        <w:rPr>
+          <w:rFonts w:ascii="Times New Roman" w:cs="Times New Roman" w:eastAsia="Times New Roman" w:hAnsi="Times New Roman"/>
+          <w:sz w:val="24"/>
+          <w:szCs w:val="24"/>
+        </w:rPr>
+        <w:t xml:space="preserve"> (120,98 USD) und </w:t>
+      </w:r>
+      <w:r>
+        <w:rPr>
+          <w:rFonts w:ascii="Times New Roman" w:cs="Times New Roman" w:eastAsia="Times New Roman" w:hAnsi="Times New Roman"/>
+          <w:i/>
+          <w:iCs/>
+          <w:sz w:val="24"/>
+          <w:szCs w:val="24"/>
+        </w:rPr>
+        <w:t xml:space="preserve">appliances</w:t>
+      </w:r>
+      <w:r>
+        <w:rPr>
+          <w:rFonts w:ascii="Times New Roman" w:cs="Times New Roman" w:eastAsia="Times New Roman" w:hAnsi="Times New Roman"/>
+          <w:sz w:val="24"/>
+          <w:szCs w:val="24"/>
+        </w:rPr>
+        <w:t xml:space="preserve"> (82,80 USD) am profitabelsten sind. Eine Aufschlüsselung nach Rabattstufen zeigt jedoch, dass </w:t>
+      </w:r>
+      <w:r>
+        <w:rPr>
+          <w:rFonts w:ascii="Times New Roman" w:cs="Times New Roman" w:eastAsia="Times New Roman" w:hAnsi="Times New Roman"/>
+          <w:i/>
+          <w:iCs/>
+          <w:sz w:val="24"/>
+          <w:szCs w:val="24"/>
+        </w:rPr>
+        <w:t xml:space="preserve">tables</w:t>
+      </w:r>
+      <w:r>
+        <w:rPr>
+          <w:rFonts w:ascii="Times New Roman" w:cs="Times New Roman" w:eastAsia="Times New Roman" w:hAnsi="Times New Roman"/>
+          <w:sz w:val="24"/>
+          <w:szCs w:val="24"/>
+        </w:rPr>
+        <w:t xml:space="preserve"> ohne Rabatt mit +292,86 USD je Position der profitabelste Bereich überhaupt ist und erst oberhalb von 20 Prozent Rabatt ins Minus rutscht (20 bis 40 Prozent: −170,44 USD; über 60 Prozent: −644,95 USD). Der Verlust folgt also aus der Rabattvergabe, nicht aus der Kalkulation.</w:t>
       </w:r>
     </w:p>
     <w:p>
@@ -3693,7 +3783,25 @@
           <w:sz w:val="24"/>
           <w:szCs w:val="24"/>
         </w:rPr>
-        <w:t xml:space="preserve">Zu RQ3: Der dominierende Verlusttreiber ist der Rabatt. Die Permutation Importance weist ihm mit 1,447 den höchsten Wert zu, vor dem Umsatz (1,353), während alle übrigen Merkmale unter 0,02 liegen. Der Umschlagpunkt liegt zwischen 25 und 27 Prozent. Auch der scheinbar defizitäre Bereich tables erweist sich als Rabattproblem; regionale Unterschiede (EMEA 9,57 USD gegenüber Canada 46,55 USD) sind nachrangig.</w:t>
+        <w:t xml:space="preserve">Zu RQ3: Der dominierende Verlusttreiber ist der Rabatt. Die Permutation Importance weist ihm mit 1,447 den höchsten Wert zu, vor dem Umsatz (1,353), während alle übrigen Merkmale unter 0,02 liegen. Der Umschlagpunkt liegt zwischen 25 und 27 Prozent. Auch der scheinbar defizitäre Bereich </w:t>
+      </w:r>
+      <w:r>
+        <w:rPr>
+          <w:rFonts w:ascii="Times New Roman" w:cs="Times New Roman" w:eastAsia="Times New Roman" w:hAnsi="Times New Roman"/>
+          <w:i/>
+          <w:iCs/>
+          <w:sz w:val="24"/>
+          <w:szCs w:val="24"/>
+        </w:rPr>
+        <w:t xml:space="preserve">tables</w:t>
+      </w:r>
+      <w:r>
+        <w:rPr>
+          <w:rFonts w:ascii="Times New Roman" w:cs="Times New Roman" w:eastAsia="Times New Roman" w:hAnsi="Times New Roman"/>
+          <w:sz w:val="24"/>
+          <w:szCs w:val="24"/>
+        </w:rPr>
+        <w:t xml:space="preserve"> erweist sich als Rabattproblem; regionale Unterschiede (EMEA 9,57 USD gegenüber Canada 46,55 USD) sind nachrangig.</w:t>
       </w:r>
     </w:p>
     <w:p>
@@ -3738,7 +3846,25 @@
           <w:sz w:val="24"/>
           <w:szCs w:val="24"/>
         </w:rPr>
-        <w:t xml:space="preserve">Zweitens sollte für die Unterkategorie tables eine verbindliche Rabattobergrenze gelten statt einer Neukalkulation des Sortiments. Der mittlere Verlust entsteht nicht durch zu niedrige Preise, sondern durch die Rabattpolitik: Ohne Rabatt erwirtschaftet der Bereich +292,86 USD je Position, oberhalb von 60 Prozent Rabatt −644,95 USD.</w:t>
+        <w:t xml:space="preserve">Zweitens sollte für die Unterkategorie </w:t>
+      </w:r>
+      <w:r>
+        <w:rPr>
+          <w:rFonts w:ascii="Times New Roman" w:cs="Times New Roman" w:eastAsia="Times New Roman" w:hAnsi="Times New Roman"/>
+          <w:i/>
+          <w:iCs/>
+          <w:sz w:val="24"/>
+          <w:szCs w:val="24"/>
+        </w:rPr>
+        <w:t xml:space="preserve">tables</w:t>
+      </w:r>
+      <w:r>
+        <w:rPr>
+          <w:rFonts w:ascii="Times New Roman" w:cs="Times New Roman" w:eastAsia="Times New Roman" w:hAnsi="Times New Roman"/>
+          <w:sz w:val="24"/>
+          <w:szCs w:val="24"/>
+        </w:rPr>
+        <w:t xml:space="preserve"> eine verbindliche Rabattobergrenze gelten statt einer Neukalkulation des Sortiments. Der mittlere Verlust entsteht nicht durch zu niedrige Preise, sondern durch die Rabattpolitik: Ohne Rabatt erwirtschaftet der Bereich +292,86 USD je Position, oberhalb von 60 Prozent Rabatt −644,95 USD.</w:t>
       </w:r>
     </w:p>
     <w:p>

</xml_diff>

<commit_message>
Zwei Kennzahlen im Bericht korrigiert (kNN 0,651; MAE 41,04/41,03), Zelle-fuer-Zelle-Dokumentation ergaenzt
</commit_message>
<xml_diff>
--- a/bericht/Bericht_ADS04_Profitvorhersage.docx
+++ b/bericht/Bericht_ADS04_Profitvorhersage.docx
@@ -2704,7 +2704,7 @@
           <w:sz w:val="24"/>
           <w:szCs w:val="24"/>
         </w:rPr>
-        <w:t xml:space="preserve">Auf Pipeline C werden drei Modellfamilien per Rastersuche optimiert: Ridge mit alpha = 0,01 (CV-R² = 0,714), kNN mit k = 10 (0,652) und der Random Forest mit max_depth = 12 (0,692). Das alpha-Raster reicht bis 100.000: Bis 100 bleibt die Güte konstant, erst bei 10.000 fällt sie auf 0,608. Bei 41.032 Beobachtungen und 47 Merkmalen besteht folglich kein Overfitting-Problem der linearen Modelle, weshalb Ridge und ungeregelte lineare Regression identische Werte liefern.</w:t>
+        <w:t xml:space="preserve">Auf Pipeline C werden drei Modellfamilien per Rastersuche optimiert: Ridge mit alpha = 0,01 (CV-R² = 0,714), kNN mit k = 10 (0,651) und der Random Forest mit max_depth = 12 (0,692). Das alpha-Raster reicht bis 100.000: Bis 100 bleibt die Güte konstant, erst bei 10.000 fällt sie auf 0,608. Bei 41.032 Beobachtungen und 47 Merkmalen besteht folglich kein Overfitting-Problem der linearen Modelle, weshalb Ridge und ungeregelte lineare Regression identische Werte liefern.</w:t>
       </w:r>
     </w:p>
     <w:p>
@@ -2989,7 +2989,7 @@
                 <w:sz w:val="21"/>
                 <w:szCs w:val="21"/>
               </w:rPr>
-              <w:t xml:space="preserve">41,03</w:t>
+              <w:t xml:space="preserve">41,04 / 41,03</w:t>
             </w:r>
           </w:p>
         </w:tc>
@@ -3572,7 +3572,7 @@
           <w:sz w:val="24"/>
           <w:szCs w:val="24"/>
         </w:rPr>
-        <w:t xml:space="preserve">Beim ausreißerrobusten MAE kehrt sich die Rangfolge um: Der Random Forest liegt mit 35,81 USD vorn, die linearen Modelle bei 41,03 USD. Ein Bootstrap-Konfidenzintervall trennt beide Befunde: Für R² schließt es die Null ein (Differenz +0,007; Intervall −0,032 bis +0,067), für den MAE nicht (Differenz +5,26 USD; Intervall +4,28 bis +5,96). Ein gruppierter Split nach Order ID und ein zeitlicher Split prüfen zudem die Robustheit: Der Vorsprung des linearen Modells besteht nur im zufälligen Split, in beiden strengeren Designs liegt der Random Forest vorn (0,684 gegenüber 0,645 bzw. 0,755 gegenüber 0,719).</w:t>
+        <w:t xml:space="preserve">Beim ausreißerrobusten MAE kehrt sich die Rangfolge um: Der Random Forest liegt mit 35,81 USD vorn, die linearen Modelle bei rund 41,0 USD. Ein Bootstrap-Konfidenzintervall trennt beide Befunde: Für R² schließt es die Null ein (Differenz +0,007; Intervall −0,032 bis +0,067), für den MAE nicht (Differenz +5,26 USD; Intervall +4,28 bis +5,96). Ein gruppierter Split nach Order ID und ein zeitlicher Split prüfen zudem die Robustheit: Der Vorsprung des linearen Modells besteht nur im zufälligen Split, in beiden strengeren Designs liegt der Random Forest vorn (0,684 gegenüber 0,645 bzw. 0,755 gegenüber 0,719).</w:t>
       </w:r>
     </w:p>
     <w:p>

</xml_diff>